<commit_message>
Audit final : corrections factuelles PPT + rapport (fuites toxiques 4/5, retained earnings -1,9M, ruptures Q3+, phase Q5)
Co-Authored-By: Claude Fable 5 <noreply@anthropic.com>
Claude-Session: https://claude.ai/code/session_018cEtmP7qR8NtdHBxqnw8VA
</commit_message>
<xml_diff>
--- a/business-simulation/AeroForge_Final_Report.docx
+++ b/business-simulation/AeroForge_Final_Report.docx
@@ -115,7 +115,7 @@
           <w:i w:val="0"/>
           <w:sz w:val="21"/>
         </w:rPr>
-        <w:t>The strategy unfolded in five phases: (1) Q1–Q2 set-up and test market — where we failed, by designing on intuition; (2) Q3 repair — rebuilt the Bolt from the revealed data, #1 Speed product within one quarter; (3) Q4 investment — VC funds into R&amp;D features, capacity ×1.5, Amsterdam, compensation catch-up; (4) Q5 expansion — 13→21 salespeople planned across three cities, proprietary tire features shipped, and the enriched-carbon bet placed; (5) Q6 harvest — the whole range relaunched on enriched carbon, first profitable quarter of the company's history (+$708k net income on $3.0M revenue).</w:t>
+        <w:t>The strategy unfolded in five phases: (1) Q1–Q2 set-up and test market — where we failed, by designing on intuition; (2) Q3 repair — rebuilt the Bolt from the revealed data, #1 Speed product within one quarter; (3) Q4 investment — VC funds into R&amp;D features, capacity ×1.5, Amsterdam, compensation catch-up; (4) Q5 expansion — sales force doubled to 13 across two cities, Bangalore opened, proprietary tire features shipped, and the enriched-carbon bet placed; (5) Q6 harvest — the whole range relaunched on enriched carbon, first profitable quarter of the company's history (+$708k net income on $3.0M revenue).</w:t>
       </w:r>
     </w:p>
     <w:p>
@@ -144,7 +144,7 @@
           <w:i w:val="0"/>
           <w:sz w:val="21"/>
         </w:rPr>
-        <w:t>Revenue grew ×13 from the test market to Q6 (226k → 373k → 740k → 1,440k → 3,018k). Net income traced the strategy: −257k, −151k, −106k (repair), −849k (Q4: planned VC deployment), −1,246k (Q5: enriched carbon R&amp;D $1.08M plus $561k of system improvements), then +708k in Q6 — the first profitable quarter, at a 62.5% gross margin (up from 53% in Q2). We financed the entire game with equity: zero conventional loans, zero emergency loans, ending with $2.06M cash and a Financial Risk score of 1.000 — the class maximum, every single quarter. Why we still scored last on cumulative Financial Performance (14.4 vs class average 40.0): the index rewards accumulated profit, and our profits arrived one quarter before the game ended. Our Wealth score (0.620, class minimum) tells the same story — $2.6M of accumulated losses against $5.0M of paid-in equity. This was the accounting shadow of a deliberate long-term strategy plus one genuinely failed quarter.</w:t>
+        <w:t>Revenue grew ×13 from the test market to Q6 (226k → 373k → 740k → 1,440k → 3,018k). Net income traced the strategy: −257k, −151k, −106k (repair), −849k (Q4: planned VC deployment), −1,246k (Q5: enriched carbon R&amp;D $1.08M plus $561k of system improvements), then +708k in Q6 — the first profitable quarter, at a 62.5% gross margin (up from 53% in Q2). We financed the entire game with equity: zero conventional loans, zero emergency loans, ending with $2.06M cash and a Financial Risk score of 1.000 — the class maximum, every single quarter. Why we still scored last on cumulative Financial Performance (14.4 vs class average 40.0): the index rewards accumulated profit, and our profits arrived one quarter before the game ended. Our Wealth score (0.620, class minimum) tells the same story — −$1.9M of retained earnings against $5.0M of paid-in equity. This was the accounting shadow of a deliberate long-term strategy plus one genuinely failed quarter.</w:t>
       </w:r>
     </w:p>
     <w:p>
@@ -219,7 +219,7 @@
           <w:i w:val="0"/>
           <w:sz w:val="21"/>
         </w:rPr>
-        <w:t>Market share went 7.0% (Q3) → 7.1% (Q4) → 5.4% (Q5, as the whole market tripled) → 8.9% (Q6). Cumulative Market Performance finished last (0.071 vs average 0.159). The root causes are documented and split cleanly in two: first, two quarters of unrecommended product (our Mountain bike sat below the Customer Union's minimum rating until Q4, so the largest distribution channel of demand simply ignored us); second, chronic under-capacity — we lost sales to stock-outs in every single quarter (42, 88, 79, then 1,083 units in Q6). The product itself ended the game top-tier: brand judgments rose from 53/62/65 (Q2–Q3) to 87 Speed, 83 Mountain (top-2), 78 Recreation (top-2) in Q6; our ads scored 80–81 after the Q3 rebuild; price judgments were at or near 100 throughout. Q6 demand of 3,318 units — 84% above our own projection — proves the offer was right; we could manufacture only 2,235. We finished the game demand-rich and capacity-poor, the exact mirror of how we started.</w:t>
+        <w:t>Market share went 7.0% (Q3) → 7.1% (Q4) → 5.4% (Q5, as the whole market tripled) → 8.9% (Q6). Cumulative Market Performance finished last (0.071 vs average 0.159). The root causes are documented and split cleanly in two: first, two quarters of unrecommended product (our Mountain bike sat below the Customer Union's minimum rating until Q4, so the largest distribution channel of demand simply ignored us); second, chronic under-capacity — we lost sales to stock-outs in every quarter from Q3 onward (42, 88, 79, then 1,083 units in Q6). The product itself ended the game top-tier: brand judgments rose from 53/62/65 (Q2–Q3) to 87 Speed, 83 Mountain (top-2), 78 Recreation (top-2) in Q6; our ads scored 80–81 after the Q3 rebuild; price judgments were at or near 100 throughout. Q6 demand of 3,318 units — 84% above our own projection — proves the offer was right; we could manufacture only 2,235. We finished the game demand-rich and capacity-poor, the exact mirror of how we started.</w:t>
       </w:r>
     </w:p>
     <w:p>
@@ -336,7 +336,7 @@
           <w:i w:val="0"/>
           <w:sz w:val="21"/>
         </w:rPr>
-        <w:t>We ran sixteen system-improvement programs by Q6: chemical collection and containment, a clean-room reverse-flow air-filtration facility (a direct response to worker memos about carbon dust and epoxy vapour — our people told us before any metric did), protective equipment, air-filtering plants, a carbon-recycling consortium, cross-training, SPC, supplier quality programs, a fitness centre, daycare, school grants and community bike trails. AeroForge was the only firm in the industry never cited for toxic leaks — the newsletter repeatedly named four of our five competitors. Ethics showed up in small decisions too: we withdrew two advertising claims the moment the truth-in-advertising check flagged them, and we declined to buy a licence for technology we already owned rather than burn shareholder cash. Cumulative Reputation finished at 0.679 vs a 0.690 average — the cost of investing nothing in improvements before Q4.</w:t>
+        <w:t>We ran sixteen system-improvement programs by Q6: chemical collection and containment, a clean-room reverse-flow air-filtration facility (a direct response to worker memos about carbon dust and epoxy vapour — our people told us before any metric did), protective equipment, air-filtering plants, a carbon-recycling consortium, cross-training, SPC, supplier quality programs, a fitness centre, daycare, school grants and community bike trails. AeroForge was never cited for toxic leaks — the newsletter repeatedly named four of our five competitors. Ethics showed up in small decisions too: we withdrew two advertising claims the moment the truth-in-advertising check flagged them, and we declined to buy a licence for technology we already owned rather than burn shareholder cash. Cumulative Reputation finished at 0.679 vs a 0.690 average — the cost of investing nothing in improvements before Q4.</w:t>
       </w:r>
     </w:p>
     <w:p>

</xml_diff>

<commit_message>
Rapport : classement final nominatif par équipe (6e à 0,27 pt de la 5e place, 5e sur le Q6 seul)
Co-Authored-By: Claude Fable 5 <noreply@anthropic.com>
Claude-Session: https://claude.ai/code/session_018cEtmP7qR8NtdHBxqnw8VA
</commit_message>
<xml_diff>
--- a/business-simulation/AeroForge_Final_Report.docx
+++ b/business-simulation/AeroForge_Final_Report.docx
@@ -357,7 +357,461 @@
           <w:i w:val="0"/>
           <w:sz w:val="21"/>
         </w:rPr>
-        <w:t>Final cumulative balanced scorecard (end of Q6), AeroForge vs class:</w:t>
+        <w:t>Final standings — cumulative Total Performance by company (the official ranking):</w:t>
+      </w:r>
+    </w:p>
+    <w:tbl>
+      <w:tblPr>
+        <w:tblStyle w:val="LightGrid-Accent6"/>
+        <w:tblW w:type="auto" w:w="0"/>
+        <w:tblLook w:firstColumn="1" w:firstRow="1" w:lastColumn="0" w:lastRow="0" w:noHBand="0" w:noVBand="1" w:val="04A0"/>
+      </w:tblPr>
+      <w:tblGrid>
+        <w:gridCol w:w="2160"/>
+        <w:gridCol w:w="2160"/>
+        <w:gridCol w:w="2160"/>
+        <w:gridCol w:w="2160"/>
+      </w:tblGrid>
+      <w:tr>
+        <w:tc>
+          <w:tcPr>
+            <w:tcW w:type="dxa" w:w="2160"/>
+          </w:tcPr>
+          <w:p>
+            <w:r/>
+            <w:r>
+              <w:rPr>
+                <w:b/>
+                <w:sz w:val="19"/>
+              </w:rPr>
+              <w:t>Rank</w:t>
+            </w:r>
+          </w:p>
+        </w:tc>
+        <w:tc>
+          <w:tcPr>
+            <w:tcW w:type="dxa" w:w="2160"/>
+          </w:tcPr>
+          <w:p>
+            <w:r/>
+            <w:r>
+              <w:rPr>
+                <w:b/>
+                <w:sz w:val="19"/>
+              </w:rPr>
+              <w:t>Company</w:t>
+            </w:r>
+          </w:p>
+        </w:tc>
+        <w:tc>
+          <w:tcPr>
+            <w:tcW w:type="dxa" w:w="2160"/>
+          </w:tcPr>
+          <w:p>
+            <w:r/>
+            <w:r>
+              <w:rPr>
+                <w:b/>
+                <w:sz w:val="19"/>
+              </w:rPr>
+              <w:t>Cumulative Total Perf.</w:t>
+            </w:r>
+          </w:p>
+        </w:tc>
+        <w:tc>
+          <w:tcPr>
+            <w:tcW w:type="dxa" w:w="2160"/>
+          </w:tcPr>
+          <w:p>
+            <w:r/>
+            <w:r>
+              <w:rPr>
+                <w:b/>
+                <w:sz w:val="19"/>
+              </w:rPr>
+              <w:t>Q6 Total Perf. (final quarter)</w:t>
+            </w:r>
+          </w:p>
+        </w:tc>
+      </w:tr>
+      <w:tr>
+        <w:tc>
+          <w:tcPr>
+            <w:tcW w:type="dxa" w:w="2160"/>
+          </w:tcPr>
+          <w:p>
+            <w:r/>
+            <w:r>
+              <w:rPr>
+                <w:sz w:val="19"/>
+              </w:rPr>
+              <w:t>1</w:t>
+            </w:r>
+          </w:p>
+        </w:tc>
+        <w:tc>
+          <w:tcPr>
+            <w:tcW w:type="dxa" w:w="2160"/>
+          </w:tcPr>
+          <w:p>
+            <w:r/>
+            <w:r>
+              <w:rPr>
+                <w:sz w:val="19"/>
+              </w:rPr>
+              <w:t>WBB</w:t>
+            </w:r>
+          </w:p>
+        </w:tc>
+        <w:tc>
+          <w:tcPr>
+            <w:tcW w:type="dxa" w:w="2160"/>
+          </w:tcPr>
+          <w:p>
+            <w:r/>
+            <w:r>
+              <w:rPr>
+                <w:sz w:val="19"/>
+              </w:rPr>
+              <w:t>54.121</w:t>
+            </w:r>
+          </w:p>
+        </w:tc>
+        <w:tc>
+          <w:tcPr>
+            <w:tcW w:type="dxa" w:w="2160"/>
+          </w:tcPr>
+          <w:p>
+            <w:r/>
+            <w:r>
+              <w:rPr>
+                <w:sz w:val="19"/>
+              </w:rPr>
+              <w:t>357.724</w:t>
+            </w:r>
+          </w:p>
+        </w:tc>
+      </w:tr>
+      <w:tr>
+        <w:tc>
+          <w:tcPr>
+            <w:tcW w:type="dxa" w:w="2160"/>
+          </w:tcPr>
+          <w:p>
+            <w:r/>
+            <w:r>
+              <w:rPr>
+                <w:sz w:val="19"/>
+              </w:rPr>
+              <w:t>2</w:t>
+            </w:r>
+          </w:p>
+        </w:tc>
+        <w:tc>
+          <w:tcPr>
+            <w:tcW w:type="dxa" w:w="2160"/>
+          </w:tcPr>
+          <w:p>
+            <w:r/>
+            <w:r>
+              <w:rPr>
+                <w:sz w:val="19"/>
+              </w:rPr>
+              <w:t>NatuRide</w:t>
+            </w:r>
+          </w:p>
+        </w:tc>
+        <w:tc>
+          <w:tcPr>
+            <w:tcW w:type="dxa" w:w="2160"/>
+          </w:tcPr>
+          <w:p>
+            <w:r/>
+            <w:r>
+              <w:rPr>
+                <w:sz w:val="19"/>
+              </w:rPr>
+              <w:t>22.149</w:t>
+            </w:r>
+          </w:p>
+        </w:tc>
+        <w:tc>
+          <w:tcPr>
+            <w:tcW w:type="dxa" w:w="2160"/>
+          </w:tcPr>
+          <w:p>
+            <w:r/>
+            <w:r>
+              <w:rPr>
+                <w:sz w:val="19"/>
+              </w:rPr>
+              <w:t>101.200</w:t>
+            </w:r>
+          </w:p>
+        </w:tc>
+      </w:tr>
+      <w:tr>
+        <w:tc>
+          <w:tcPr>
+            <w:tcW w:type="dxa" w:w="2160"/>
+          </w:tcPr>
+          <w:p>
+            <w:r/>
+            <w:r>
+              <w:rPr>
+                <w:sz w:val="19"/>
+              </w:rPr>
+              <w:t>3</w:t>
+            </w:r>
+          </w:p>
+        </w:tc>
+        <w:tc>
+          <w:tcPr>
+            <w:tcW w:type="dxa" w:w="2160"/>
+          </w:tcPr>
+          <w:p>
+            <w:r/>
+            <w:r>
+              <w:rPr>
+                <w:sz w:val="19"/>
+              </w:rPr>
+              <w:t>Spe3d</w:t>
+            </w:r>
+          </w:p>
+        </w:tc>
+        <w:tc>
+          <w:tcPr>
+            <w:tcW w:type="dxa" w:w="2160"/>
+          </w:tcPr>
+          <w:p>
+            <w:r/>
+            <w:r>
+              <w:rPr>
+                <w:sz w:val="19"/>
+              </w:rPr>
+              <w:t>8.662</w:t>
+            </w:r>
+          </w:p>
+        </w:tc>
+        <w:tc>
+          <w:tcPr>
+            <w:tcW w:type="dxa" w:w="2160"/>
+          </w:tcPr>
+          <w:p>
+            <w:r/>
+            <w:r>
+              <w:rPr>
+                <w:sz w:val="19"/>
+              </w:rPr>
+              <w:t>31.720</w:t>
+            </w:r>
+          </w:p>
+        </w:tc>
+      </w:tr>
+      <w:tr>
+        <w:tc>
+          <w:tcPr>
+            <w:tcW w:type="dxa" w:w="2160"/>
+          </w:tcPr>
+          <w:p>
+            <w:r/>
+            <w:r>
+              <w:rPr>
+                <w:sz w:val="19"/>
+              </w:rPr>
+              <w:t>4</w:t>
+            </w:r>
+          </w:p>
+        </w:tc>
+        <w:tc>
+          <w:tcPr>
+            <w:tcW w:type="dxa" w:w="2160"/>
+          </w:tcPr>
+          <w:p>
+            <w:r/>
+            <w:r>
+              <w:rPr>
+                <w:sz w:val="19"/>
+              </w:rPr>
+              <w:t>Carbon-Ride</w:t>
+            </w:r>
+          </w:p>
+        </w:tc>
+        <w:tc>
+          <w:tcPr>
+            <w:tcW w:type="dxa" w:w="2160"/>
+          </w:tcPr>
+          <w:p>
+            <w:r/>
+            <w:r>
+              <w:rPr>
+                <w:sz w:val="19"/>
+              </w:rPr>
+              <w:t>2.918</w:t>
+            </w:r>
+          </w:p>
+        </w:tc>
+        <w:tc>
+          <w:tcPr>
+            <w:tcW w:type="dxa" w:w="2160"/>
+          </w:tcPr>
+          <w:p>
+            <w:r/>
+            <w:r>
+              <w:rPr>
+                <w:sz w:val="19"/>
+              </w:rPr>
+              <w:t>4.534</w:t>
+            </w:r>
+          </w:p>
+        </w:tc>
+      </w:tr>
+      <w:tr>
+        <w:tc>
+          <w:tcPr>
+            <w:tcW w:type="dxa" w:w="2160"/>
+          </w:tcPr>
+          <w:p>
+            <w:r/>
+            <w:r>
+              <w:rPr>
+                <w:sz w:val="19"/>
+              </w:rPr>
+              <w:t>5</w:t>
+            </w:r>
+          </w:p>
+        </w:tc>
+        <w:tc>
+          <w:tcPr>
+            <w:tcW w:type="dxa" w:w="2160"/>
+          </w:tcPr>
+          <w:p>
+            <w:r/>
+            <w:r>
+              <w:rPr>
+                <w:sz w:val="19"/>
+              </w:rPr>
+              <w:t>The Bike Yard</w:t>
+            </w:r>
+          </w:p>
+        </w:tc>
+        <w:tc>
+          <w:tcPr>
+            <w:tcW w:type="dxa" w:w="2160"/>
+          </w:tcPr>
+          <w:p>
+            <w:r/>
+            <w:r>
+              <w:rPr>
+                <w:sz w:val="19"/>
+              </w:rPr>
+              <w:t>0.968</w:t>
+            </w:r>
+          </w:p>
+        </w:tc>
+        <w:tc>
+          <w:tcPr>
+            <w:tcW w:type="dxa" w:w="2160"/>
+          </w:tcPr>
+          <w:p>
+            <w:r/>
+            <w:r>
+              <w:rPr>
+                <w:sz w:val="19"/>
+              </w:rPr>
+              <w:t>3.318</w:t>
+            </w:r>
+          </w:p>
+        </w:tc>
+      </w:tr>
+      <w:tr>
+        <w:tc>
+          <w:tcPr>
+            <w:tcW w:type="dxa" w:w="2160"/>
+          </w:tcPr>
+          <w:p>
+            <w:r/>
+            <w:r>
+              <w:rPr>
+                <w:sz w:val="19"/>
+              </w:rPr>
+              <w:t>6</w:t>
+            </w:r>
+          </w:p>
+        </w:tc>
+        <w:tc>
+          <w:tcPr>
+            <w:tcW w:type="dxa" w:w="2160"/>
+          </w:tcPr>
+          <w:p>
+            <w:r/>
+            <w:r>
+              <w:rPr>
+                <w:sz w:val="19"/>
+              </w:rPr>
+              <w:t>AeroForge</w:t>
+            </w:r>
+          </w:p>
+        </w:tc>
+        <w:tc>
+          <w:tcPr>
+            <w:tcW w:type="dxa" w:w="2160"/>
+          </w:tcPr>
+          <w:p>
+            <w:r/>
+            <w:r>
+              <w:rPr>
+                <w:sz w:val="19"/>
+              </w:rPr>
+              <w:t>0.703</w:t>
+            </w:r>
+          </w:p>
+        </w:tc>
+        <w:tc>
+          <w:tcPr>
+            <w:tcW w:type="dxa" w:w="2160"/>
+          </w:tcPr>
+          <w:p>
+            <w:r/>
+            <w:r>
+              <w:rPr>
+                <w:sz w:val="19"/>
+              </w:rPr>
+              <w:t>3.494</w:t>
+            </w:r>
+          </w:p>
+        </w:tc>
+      </w:tr>
+    </w:tbl>
+    <w:p>
+      <w:pPr>
+        <w:spacing w:after="40"/>
+      </w:pPr>
+    </w:p>
+    <w:p>
+      <w:pPr>
+        <w:spacing w:after="120"/>
+      </w:pPr>
+      <w:r>
+        <w:rPr>
+          <w:b w:val="0"/>
+          <w:i w:val="0"/>
+          <w:sz w:val="21"/>
+        </w:rPr>
+        <w:t>Two readings of this table matter. First, the honest one: we finished sixth of six. Second, the trajectory one: the gap to fifth place is 0.27 points — while fourth place sits at 2.9 and first at 54 — and on the final quarter taken alone we were no longer last (3.494 vs The Bike Yard's 3.318). The turnaround had already begun overtaking a competitor when the game ended.</w:t>
+      </w:r>
+    </w:p>
+    <w:p>
+      <w:pPr>
+        <w:spacing w:after="120"/>
+      </w:pPr>
+      <w:r>
+        <w:rPr>
+          <w:b w:val="0"/>
+          <w:i w:val="0"/>
+          <w:sz w:val="21"/>
+        </w:rPr>
+        <w:t>Final cumulative balanced scorecard, AeroForge vs class:</w:t>
       </w:r>
     </w:p>
     <w:tbl>

</xml_diff>

<commit_message>
Final Report réécrit sur un ton humain (voix du BP corrigé) — mêmes idées, chiffres et tableaux
Co-Authored-By: Claude Fable 5 <noreply@anthropic.com>
Claude-Session: https://claude.ai/code/session_018cEtmP7qR8NtdHBxqnw8VA
</commit_message>
<xml_diff>
--- a/business-simulation/AeroForge_Final_Report.docx
+++ b/business-simulation/AeroForge_Final_Report.docx
@@ -35,7 +35,7 @@
           <w:color w:val="52514E"/>
           <w:sz w:val="20"/>
         </w:rPr>
-        <w:t>Team: Aaron Rainier (President) · Luna Carballo (VP Marketing) · Justine Pellier (VP Analytics) · Patrick Yang (VP Finance) · Sarah Baraket (VP Sales) · Teysnim Abichou (VP HR)</w:t>
+        <w:t>Executive team: Aaron Rainier (President) · Luna Carballo (VP Marketing) · Justine Pellier (VP Business Analytics) · Patrick Yang (VP Accounting &amp; Finance) · Sarah Baraket (VP Sales) · Teysnim Abichou (VP Human Resources)</w:t>
       </w:r>
     </w:p>
     <w:p>
@@ -81,7 +81,7 @@
           <w:i w:val="0"/>
           <w:sz w:val="21"/>
         </w:rPr>
-        <w:t>Did the mission actually guide us? Partly at first, fully at the end. In quarters 1–2 it was a statement; from quarter 3 onward it became an operating rule with measurable consequences: we never entered a price war (premium positioning held even when we were last in market share); we kept investing in employees and the environment during loss-making quarters (clean-room air filtration, chemical containment, top-of-market compensation); and when the industry's safety crisis hit — standard carbon fiber frames injuring mountain riders — the mission made the decision for us: we invested $1.02M in enriched carbon fiber, the largest single bet of our game, to sell a bike that is actually safe to ride. By Q6, our entire range was built on it.</w:t>
+        <w:t>We wrote this mission on the first afternoon, before we had sold a single bike, and if we are honest it stayed mostly words for the first two quarters. From quarter 3 it started to mean something concrete. It kept us out of a price war when we were last in market share and cutting prices would have been the easy move. It made us keep spending on our workers and on the environment during quarters when we were losing money. And when the industry news broke that standard carbon frames were breaking and injuring mountain riders, the biggest decision of our game — spending $1.02M on enriched carbon fiber — was actually not a hard one to make. Our mission says we sell bikes that let people conquer any trail; that has to mean bikes that are safe to ride. By Q6, our entire range was built on enriched carbon.</w:t>
       </w:r>
     </w:p>
     <w:p>
@@ -102,7 +102,7 @@
           <w:i w:val="0"/>
           <w:sz w:val="21"/>
         </w:rPr>
-        <w:t>Target segments: Mountain (primary) and Speed (secondary), with an opportunistic Recreation extension (AeroForgeComfy) added by the team in Q4 at marginal cost. Positioning: premium, value-driven, conscious-capitalism — win on product quality and integrity, never on price. Distribution: New York City, then Amsterdam (opened Q4 — the game's largest market at 3,789 units/quarter when we committed), then Bangalore (opened Q5). Funding: $1.5M founding equity plus $1.0M team tranches, then a $2.5M venture round obtained on our business plan and deployed exactly as promised (R&amp;D, production capacity, stores).</w:t>
+        <w:t>We chose Mountain as our primary segment and Speed as our secondary one, because they were the two most profitable segments and their needs overlap enough to share technology. In Q4 the team added a third, opportunistic brand for the Recreation segment (AeroForgeComfy) — outside our core strategy, but cheap to do and, in the end, a good call. Our positioning never changed: premium bikes, sold on quality and integrity, never on price. Distribution followed the demand data: New York first, then Amsterdam in Q4 (the largest market in the game when we committed to it), then Bangalore in Q5. All of this was funded by $1.5M of founding capital, $1.0M of team tranches, and the $2.5M venture round we obtained on our business plan — money we spent exactly the way we told the investors we would: R&amp;D, production capacity, stores.</w:t>
       </w:r>
     </w:p>
     <w:p>
@@ -115,7 +115,7 @@
           <w:i w:val="0"/>
           <w:sz w:val="21"/>
         </w:rPr>
-        <w:t>The strategy unfolded in five phases: (1) Q1–Q2 set-up and test market — where we failed, by designing on intuition; (2) Q3 repair — rebuilt the Bolt from the revealed data, #1 Speed product within one quarter; (3) Q4 investment — VC funds into R&amp;D features, capacity ×1.5, Amsterdam, compensation catch-up; (4) Q5 expansion — sales force doubled to 13 across two cities, Bangalore opened, proprietary tire features shipped, and the enriched-carbon bet placed; (5) Q6 harvest — the whole range relaunched on enriched carbon, first profitable quarter of the company's history (+$708k net income on $3.0M revenue).</w:t>
+        <w:t>Looking back, our six quarters split into five phases. Quarters 1–2: set up and test the market — this is where we failed, by designing on intuition. Quarter 3: repair — we rebuilt the Bolt from the market data and it became the #1-rated Speed bike within one quarter. Quarter 4: invest — the venture money went into R&amp;D features, more capacity, the Amsterdam store, and a compensation catch-up for our people. Quarter 5: expand — we doubled the sales force to 13 across two cities, opened Bangalore, shipped our own tire technologies, and placed the enriched-carbon bet. Quarter 6: harvest — the whole range relaunched on enriched carbon, and the company posted the first profit of its history: +$708k on $3.0M of revenue.</w:t>
       </w:r>
     </w:p>
     <w:p>
@@ -144,7 +144,20 @@
           <w:i w:val="0"/>
           <w:sz w:val="21"/>
         </w:rPr>
-        <w:t>Revenue grew ×13 from the test market to Q6 (226k → 373k → 740k → 1,440k → 3,018k). Net income traced the strategy: −257k, −151k, −106k (repair), −849k (Q4: planned VC deployment), −1,246k (Q5: enriched carbon R&amp;D $1.08M plus $561k of system improvements), then +708k in Q6 — the first profitable quarter, at a 62.5% gross margin (up from 53% in Q2). We financed the entire game with equity: zero conventional loans, zero emergency loans, ending with $2.06M cash and a Financial Risk score of 1.000 — the class maximum, every single quarter. Why we still scored last on cumulative Financial Performance (14.4 vs class average 40.0): the index rewards accumulated profit, and our profits arrived one quarter before the game ended. Our Wealth score (0.620, class minimum) tells the same story — −$1.9M of retained earnings against $5.0M of paid-in equity. This was the accounting shadow of a deliberate long-term strategy plus one genuinely failed quarter.</w:t>
+        <w:t>Our revenue grew ×13 between the test market and Q6: 226k, 373k, 740k, 1,440k, then 3,018k. The net income line tells the story of the whole company: three small losses while we repaired the product (−257k, −151k, −106k), one big planned loss when we deployed the venture money (−849k in Q4), an even bigger one in Q5 when we bought the enriched carbon technology (−1,246k) — and then, in the final quarter, our first profit: +708k, at a 62.5% gross margin, up from 53% in Q2. Through all of it we never borrowed a dollar: no bank loans, no emergency loans, and a Financial Risk score of 1.000 — the class maximum — every single quarter. We finished with $2.06M in cash.</w:t>
+      </w:r>
+    </w:p>
+    <w:p>
+      <w:pPr>
+        <w:spacing w:after="120"/>
+      </w:pPr>
+      <w:r>
+        <w:rPr>
+          <w:b w:val="0"/>
+          <w:i w:val="0"/>
+          <w:sz w:val="21"/>
+        </w:rPr>
+        <w:t>So why did we still finish last on cumulative financial performance (14.4 against a class average of 40.0)? Because the index rewards accumulated profit, and ours arrived one quarter before the game ended. Our Wealth score says the same thing: −$1.9M of retained earnings against $5.0M of paid-in capital. That is the bill for the quarter we failed, and for a strategy that deliberately spent the middle of the game preparing for the end of it.</w:t>
       </w:r>
     </w:p>
     <w:p>
@@ -219,7 +232,20 @@
           <w:i w:val="0"/>
           <w:sz w:val="21"/>
         </w:rPr>
-        <w:t>Market share went 7.0% (Q3) → 7.1% (Q4) → 5.4% (Q5, as the whole market tripled) → 8.9% (Q6). Cumulative Market Performance finished last (0.071 vs average 0.159). The root causes are documented and split cleanly in two: first, two quarters of unrecommended product (our Mountain bike sat below the Customer Union's minimum rating until Q4, so the largest distribution channel of demand simply ignored us); second, chronic under-capacity — we lost sales to stock-outs in every quarter from Q3 onward (42, 88, 79, then 1,083 units in Q6). The product itself ended the game top-tier: brand judgments rose from 53/62/65 (Q2–Q3) to 87 Speed, 83 Mountain (top-2), 78 Recreation (top-2) in Q6; our ads scored 80–81 after the Q3 rebuild; price judgments were at or near 100 throughout. Q6 demand of 3,318 units — 84% above our own projection — proves the offer was right; we could manufacture only 2,235. We finished the game demand-rich and capacity-poor, the exact mirror of how we started.</w:t>
+        <w:t>This is where our early mistakes cost us the most. Our market share went from 7.0% in Q3 to 8.9% in Q6, and our cumulative Market Performance finished last (0.071 against an average of 0.159). The causes are well documented and there are exactly two. First, for two quarters our Mountain bike sat below the Customer Union's minimum rating, so the biggest source of demand in the game simply did not recommend us. Second, once we fixed the products, we could never build enough of them: we lost sales to stock-outs in every quarter from Q3 onward — 42, 88, 79, and then 1,083 units in Q6 alone.</w:t>
+      </w:r>
+    </w:p>
+    <w:p>
+      <w:pPr>
+        <w:spacing w:after="120"/>
+      </w:pPr>
+      <w:r>
+        <w:rPr>
+          <w:b w:val="0"/>
+          <w:i w:val="0"/>
+          <w:sz w:val="21"/>
+        </w:rPr>
+        <w:t>The frustrating part is that the product ended the game excellent. Brand judgments rose from 53, 62 and 65 in the early quarters to 87 (Speed), 83 (Mountain, top-2) and 78 (Recreation, top-2) in Q6. Our advertising, rebuilt in Q3–Q4, scored 80 and above. Our prices rated at or near 100 throughout. In Q6, customers asked us for 3,318 bikes — 84% more than we ourselves had dared to project — and we could only deliver 2,235. We started the game with a product nobody wanted enough, and finished it with a product we could not build enough of.</w:t>
       </w:r>
     </w:p>
     <w:p>
@@ -294,7 +320,7 @@
           <w:i w:val="0"/>
           <w:sz w:val="21"/>
         </w:rPr>
-        <w:t>Production capacity scaled 6 → 11 → 16 → 32 units/day across Q3–Q6 (two 3D-printer purchases, $960k), with worker productivity up from 68.6% to 82.4% and unit labour cost down from $108 to $84. Quality investments (SPC, operator training, supplier programs) raised reliability steadily. Our recurring operational failure was demand planning: after every product fix, demand responded non-linearly and we projected linearly — four consecutive quarters of stock-outs, culminating in 1,083 lost sales in Q6 (≈$1.4M of revenue left on the table). We treated capacity as a cost to be minimised when it was in fact our binding constraint.</w:t>
+        <w:t>Production capacity scaled from 6 to 32 units per day across the game (6 → 11 → 16 → 32), with two 3D-printer purchases totalling $960k. Worker productivity climbed from 68.6% to 82.4% and unit labour cost fell from $108 to $84. Quality investments — statistical process control, operator training, supplier programs — steadily improved reliability. Our recurring operational mistake was simpler and more human: we kept underestimating our own demand. Every time we fixed something in marketing, more customers showed up than we had planned for, four quarters in a row, and roughly $1.4M of Q6 revenue was left on the table. We kept treating capacity as a cost to be minimised when it had quietly become our real bottleneck.</w:t>
       </w:r>
     </w:p>
     <w:p>
@@ -315,7 +341,7 @@
           <w:i w:val="0"/>
           <w:sz w:val="21"/>
         </w:rPr>
-        <w:t>In Q2–Q3 we paid below market (worker satisfaction 71.9%, turnover 32%/quarter, productivity falling) — a false economy that starved the factory. From Q4 we moved every package to the top of the market (workers $13.2k + expanded health + 3 weeks vacation + 5% pension; equivalent upgrades for supervisors and the sales force). Results: satisfaction 88%, turnover 11%, productivity +14 points, and the sales force among the best-compensated in the industry. Cumulative HR Management finished at 0.790 vs a 0.801 average — the two cheap early quarters cost us an above-average final score.</w:t>
+        <w:t>We learned this one the hard way. In quarters 2–3 we paid our people below the market. On paper it looked like savings; in reality it was one of the most expensive decisions of our game — worker satisfaction sat at 71.9%, a third of our workforce left every quarter, and productivity fell while our competitors' rose. From Q4 we moved every package to the top of the market: $13.2k base for workers with expanded health cover, three weeks of vacation and a 5% pension, with equivalent upgrades for supervisors and the sales force. People stayed (turnover fell from 32% to 11%), worked better (+14 productivity points) and were visibly happier (satisfaction 88%). Our cumulative HR score finished at 0.790 against a 0.801 average — those two cheap early quarters are the whole difference.</w:t>
       </w:r>
     </w:p>
     <w:p>
@@ -336,7 +362,7 @@
           <w:i w:val="0"/>
           <w:sz w:val="21"/>
         </w:rPr>
-        <w:t>We ran sixteen system-improvement programs by Q6: chemical collection and containment, a clean-room reverse-flow air-filtration facility (a direct response to worker memos about carbon dust and epoxy vapour — our people told us before any metric did), protective equipment, air-filtering plants, a carbon-recycling consortium, cross-training, SPC, supplier quality programs, a fitness centre, daycare, school grants and community bike trails. AeroForge was never cited for toxic leaks — the newsletter repeatedly named four of our five competitors. Ethics showed up in small decisions too: we withdrew two advertising claims the moment the truth-in-advertising check flagged them, and we declined to buy a licence for technology we already owned rather than burn shareholder cash. Cumulative Reputation finished at 0.679 vs a 0.690 average — the cost of investing nothing in improvements before Q4.</w:t>
+        <w:t>By the end of the game we were running sixteen improvement programs: chemical collection and containment, a clean-room air-filtration facility, protective equipment, air-filtering plants, a carbon-recycling consortium, cross-training, quality programs with our suppliers, a fitness centre, daycare, school grants and community bike trails. We want to be honest about where the clean room came from: not from a metric, but from two memos written by our own production workers telling us they were breathing carbon dust and epoxy vapour. Our people told us before any number did, and we acted the same quarter. AeroForge was never cited for toxic leaks — the industry newsletter repeatedly named four of our five competitors. Ethics also cost us something real twice: we withdrew advertising claims both times the truth-in-advertising check flagged them, and we declined to buy a licence for a technology we had already developed ourselves rather than waste shareholder money. Our cumulative Reputation score, 0.679 against a 0.690 average, carries the trace of starting all of this only in Q4.</w:t>
       </w:r>
     </w:p>
     <w:p>
@@ -345,6 +371,19 @@
       </w:pPr>
       <w:r>
         <w:t>4. Main Results vs. Other Teams</w:t>
+      </w:r>
+    </w:p>
+    <w:p>
+      <w:pPr>
+        <w:spacing w:after="120"/>
+      </w:pPr>
+      <w:r>
+        <w:rPr>
+          <w:b w:val="0"/>
+          <w:i w:val="0"/>
+          <w:sz w:val="21"/>
+        </w:rPr>
+        <w:t>The tables below compare us with the other five teams, without cosmetics.</w:t>
       </w:r>
     </w:p>
     <w:p>
@@ -798,7 +837,7 @@
           <w:i w:val="0"/>
           <w:sz w:val="21"/>
         </w:rPr>
-        <w:t>Two readings of this table matter. First, the honest one: we finished sixth of six. Second, the trajectory one: the gap to fifth place is 0.27 points — while fourth place sits at 2.9 and first at 54 — and on the final quarter taken alone we were no longer last (3.494 vs The Bike Yard's 3.318). The turnaround had already begun overtaking a competitor when the game ended.</w:t>
+        <w:t>There are two honest ways to read this table. The first: we finished sixth out of six. The second: the gap to fifth place is 0.27 points — fourth place sits at 2.9 and first at 54 — and on the final quarter taken alone we were no longer last. The game stopped at the moment our curve was starting to cross the others.</w:t>
       </w:r>
     </w:p>
     <w:p>
@@ -811,7 +850,7 @@
           <w:i w:val="0"/>
           <w:sz w:val="21"/>
         </w:rPr>
-        <w:t>Final cumulative balanced scorecard, AeroForge vs class:</w:t>
+        <w:t>Final cumulative balanced scorecard, AeroForge against the class:</w:t>
       </w:r>
     </w:p>
     <w:tbl>
@@ -2073,7 +2112,7 @@
           <w:i w:val="0"/>
           <w:sz w:val="21"/>
         </w:rPr>
-        <w:t>Q6 market share by company: WBB 36.0%, NatuRide 21.3%, Spe3d 17.0%, Carbon-Ride 9.8%, AeroForge 8.9%, The Bike Yard 7.0%. Reading the two tables together explains our final ranking honestly: the cumulative index is dominated by accumulated financial performance, and a 17× gap to the class average in Q2, compounded quarterly, is mathematically unrecoverable in four quarters — even while posting the steepest relative improvement in the class and finishing first on the two metrics that were winnable from any starting position: Investment in Future and Financial Risk.</w:t>
+        <w:t>Read together, the tables explain our ranking honestly. The cumulative index is driven by accumulated financial results, and starting 17 times below the class average in Q2 is not something four quarters can repair, however steep the recovery. What the same tables also show is that the two metrics a team can win from any starting position — Investment in Future and Financial Risk — we won, finishing first in class on both.</w:t>
       </w:r>
     </w:p>
     <w:p>
@@ -2094,7 +2133,7 @@
           <w:i w:val="0"/>
           <w:sz w:val="21"/>
         </w:rPr>
-        <w:t>Lesson 1 — Under uncertainty, intuition is a hypothesis, not a decision. Our Q2 failure had three specific, avoidable causes: a Speed advertisement built on Mountain imagery and claims (scored 35/100 — it actually rated higher with Mountain customers than Speed customers); 'comfort' components on a mountain bike that felt logical and scored 62, below the Customer Union's recommendation threshold; and a brand architecture chosen before buying the market research that would have falsified all of it. The ~$45k of studies we skipped cost us two quarters of momentum and, through the cumulative scorecard, the game.</w:t>
+        <w:t>Lesson 1 — Under uncertainty, intuition is a hypothesis, not a decision. Written down, our three Q2 mistakes look almost silly: a race-bike advertisement full of mountain images and claims (it scored 35/100 — it actually appealed more to Mountain customers than to the Speed customers it was made for); a comfort handlebar and comfort seat on a mountain bike, because comfort sounded nice (the bike scored 62, below the recommendation threshold, so the Customer Union simply never recommended us); and the choice to skip roughly $45k of market studies to save money. That last one was the real mistake — the data that would have corrected the first two was on sale the whole time. It cost us two quarters and, through the cumulative scorecard, the game.</w:t>
       </w:r>
     </w:p>
     <w:p>
@@ -2107,7 +2146,7 @@
           <w:i w:val="0"/>
           <w:sz w:val="21"/>
         </w:rPr>
-        <w:t>Lesson 2 — The business disciplines are one system. A 35-point ad starved the factory; below-market pay cut productivity, which capped output, which turned marketing wins into stock-outs. We never lost money 'in finance' — every financial loss originated upstream in a marketing or HR decision. The pro forma only reported it.</w:t>
+        <w:t>Lesson 2 — The business disciplines are one system. A 35-point ad starves a factory. Below-market pay cuts productivity, which caps output, which turns your marketing wins into stock-outs. We never once lost money 'in finance': every loss we posted was born upstream, in a marketing or HR decision, and the accounts just recorded it.</w:t>
       </w:r>
     </w:p>
     <w:p>
@@ -2120,7 +2159,7 @@
           <w:i w:val="0"/>
           <w:sz w:val="21"/>
         </w:rPr>
-        <w:t>Lesson 3 — Learn how the scorecard computes before playing, not after. Metrics winnable from day one regardless of sales volume — Investment in Future, Financial Risk — we eventually won, but only started managing deliberately from Q4. The cumulative Total Performance metric punishes one bad quarter forever; protecting the floor matters more than raising the ceiling.</w:t>
+        <w:t>Lesson 3 — Learn how the scorecard is computed before playing, not after. Some metrics can be won from any position, whatever your sales volume — Investment in Future, Financial Risk — and we did win them, but we only started managing them deliberately from Q4. The cumulative Total Performance metric, on the other hand, never forgets a bad quarter. Protecting the floor matters more than raising the ceiling.</w:t>
       </w:r>
     </w:p>
     <w:p>
@@ -2133,7 +2172,7 @@
           <w:i w:val="0"/>
           <w:sz w:val="21"/>
         </w:rPr>
-        <w:t>Lesson 4 — When product quality jumps, demand responds non-linearly. We under-projected demand in all four post-repair quarters (Q6: 3,318 actual vs 1,800 projected) because we extrapolated linearly from the previous quarter. Capacity should be built ahead of proven product quality, not behind realised sales.</w:t>
+        <w:t>Lesson 4 — When product quality jumps, demand does not follow politely. It jumps too. We under-projected demand in all four quarters after our repairs, ending with 3,318 units of Q6 demand against our own projection of 1,800, because we kept extrapolating in straight lines. Capacity should be built ahead of proven product quality, not behind last quarter's sales.</w:t>
       </w:r>
     </w:p>
     <w:p>
@@ -2146,7 +2185,7 @@
           <w:i w:val="0"/>
           <w:sz w:val="21"/>
         </w:rPr>
-        <w:t>Lesson 5 — People signal problems before metrics do. Worker memos about carbon dust preceded any measurable morale drop; acting on them (clean room, protective equipment) preceded the productivity and satisfaction gains. The in-basket was our cheapest and fastest market research.</w:t>
+        <w:t>Lesson 5 — People tell you before the metrics do. The worker memos about carbon dust arrived before any visible drop in morale; acting on them came before the gains in productivity and satisfaction. The in-basket turned out to be our cheapest and fastest market research.</w:t>
       </w:r>
     </w:p>
     <w:p>
@@ -2159,7 +2198,7 @@
           <w:i w:val="0"/>
           <w:sz w:val="21"/>
         </w:rPr>
-        <w:t>How we changed our working methods mid-week: from Q3 every decision required a number from a purchased study or a revealed competitor matrix; every advertisement passed the truth-in-advertising check before submission; every quarter ended with the same discipline — Final Check, then the pro forma recomputed last; and each VP owned one function with the President arbitrating trade-offs. The rhythm turned a failing start-up into a machine that improved every metric it touched, every quarter, for four consecutive quarters.</w:t>
+        <w:t>The real turning point was not a single decision but a change in how we worked. From Q3 onward, nobody in our meetings could defend a choice without a number behind it — a purchased study, a revealed competitor matrix, an industry table. Every advertisement went through the truth-in-advertising check before submission. Every quarter closed the same way: Final Check, then the pro forma recomputed last. Each VP owned one function and the President arbitrated the trade-offs. That routine is what turned a failing start-up into a company that improved every metric it touched, four quarters in a row.</w:t>
       </w:r>
     </w:p>
     <w:p>
@@ -2180,7 +2219,7 @@
           <w:i w:val="0"/>
           <w:sz w:val="21"/>
         </w:rPr>
-        <w:t>The game's own metric answers this: AeroForge finished first in class on cumulative Investment in Future. Concretely, a hypothetical Q7 would open with: (1) the industry's only fully enriched-carbon range, rated 87/83/78, one quarter after competitors began converting theirs; (2) proprietary R&amp;D in the pipeline — hybrid comfort tires paid for and ready in Q7 for the Recreation line; (3) a modern factory at 32 units/day of fixed capacity with an 82% productive, 88%-satisfied, 11%-turnover workforce; (4) three stores covering the three largest markets with 21 trained sales and service people; (5) $2.06M of cash, a $200k certificate of deposit, zero debt and an intact borrowing capacity; and (6) sixteen running system improvements protecting quality, the environment and the community. Proven Q6 demand of 3,318 units against 2,235 produced means the first Q7 decision is already written: one more printer and a third production shift.</w:t>
+        <w:t>We know 'we prepared the future' can sound like an excuse from a team that finished last, so we will let the game's own measurement speak first: AeroForge finished first in class on cumulative Investment in Future. In concrete terms, a hypothetical Q7 would have opened with the industry's only fully enriched-carbon range, rated 87/83/78 one quarter after competitors began converting theirs; our own tire technologies on the road and a further one — hybrid comfort tires for the Recreation line — already paid for and arriving; a modern 32-units-per-day factory run by a stable, well-paid workforce (82% productivity, 11% turnover); three stores covering the three largest markets with 21 trained sales and service people; $2.06M in cash, zero debt and untouched borrowing capacity; and sixteen running programs protecting quality, the environment and our community. Proven Q6 demand of 3,318 units against 2,235 produced means the first Q7 decision was already obvious: one more printer and a third shift.</w:t>
       </w:r>
     </w:p>
     <w:p>
@@ -2201,7 +2240,7 @@
           <w:i w:val="0"/>
           <w:sz w:val="21"/>
         </w:rPr>
-        <w:t>1. Spend the first dollar on information. Buy every market study from the test market onward and design brands, ads and prices from the component matrices and revealed leader structures — never from instinct. One failed quarter costs fifty times the price of the studies.</w:t>
+        <w:t>1. Spend your first dollar on information. Buy every market study from the test market onward, and design brands, ads and prices from the data — never from instinct. One failed quarter costs fifty times the price of the studies.</w:t>
       </w:r>
     </w:p>
     <w:p>
@@ -2214,7 +2253,7 @@
           <w:i w:val="0"/>
           <w:sz w:val="21"/>
         </w:rPr>
-        <w:t>2. Benchmark everything before shipping — an ad against the truth-check, a salary against the industry tables, a price against willingness-to-pay. The market has usually already published the right answer.</w:t>
+        <w:t>2. Benchmark everything before you ship it: an ad against the truth-check, a salary against the industry tables, a price against what customers say they will pay. The market has usually already published the right answer.</w:t>
       </w:r>
     </w:p>
     <w:p>
@@ -2227,7 +2266,7 @@
           <w:i w:val="0"/>
           <w:sz w:val="21"/>
         </w:rPr>
-        <w:t>3. Build capacity ahead of product quality, not behind sales. Once judgments are top-tier, demand arrives non-linearly; four quarters of stock-outs converted our best marketing into our competitors' revenue.</w:t>
+        <w:t>3. Build capacity ahead of product quality, not behind sales. Once your ratings are top-tier, demand arrives faster than a spreadsheet expects; four quarters of stock-outs handed our best marketing to our competitors.</w:t>
       </w:r>
     </w:p>
     <w:p>
@@ -2240,7 +2279,7 @@
           <w:i w:val="0"/>
           <w:sz w:val="21"/>
         </w:rPr>
-        <w:t>4. Pay people at the top of the market from quarter one. The morale→productivity→output loop compounds slowly; started late, it cannot catch up.</w:t>
+        <w:t>4. Pay people at the top of the market from quarter one. The morale-to-productivity loop compounds slowly, and started late it never fully catches up.</w:t>
       </w:r>
     </w:p>
     <w:p>
@@ -2253,7 +2292,7 @@
           <w:i w:val="0"/>
           <w:sz w:val="21"/>
         </w:rPr>
-        <w:t>5. Read the scorecard's formulas on day one and protect the cumulative floor: never let a single quarter crater, because the index never forgets.</w:t>
+        <w:t>5. Read the scorecard's formulas on day one, and protect the cumulative floor: one collapsed quarter follows you to the end, because the index never forgets.</w:t>
       </w:r>
     </w:p>
     <w:p>
@@ -2266,7 +2305,7 @@
           <w:i w:val="0"/>
           <w:sz w:val="21"/>
         </w:rPr>
-        <w:t>6. Keep the financial discipline we kept: no emergency borrowing, investments financed by equity actually raised on a credible plan. Financial Risk was the one perfect score available to everyone; most teams dropped it.</w:t>
+        <w:t>6. Keep the financial discipline we kept: no emergency borrowing, investments financed by capital actually raised on a credible plan. Financial Risk was a perfect score available to every team; most dropped it.</w:t>
       </w:r>
     </w:p>
     <w:p>
@@ -2279,7 +2318,7 @@
           <w:i/>
           <w:sz w:val="21"/>
         </w:rPr>
-        <w:t>We lost the race, and we know precisely why — which is the one outcome this simulation is designed to produce. Given a seventh quarter, the machine we built in the last four would have been the most dangerous company in the industry.</w:t>
+        <w:t>We lost this race, and we know exactly why — which is, we believe, the outcome this simulation is designed to produce. Give the machine we built over the last four quarters a seventh one, and we would have been the most dangerous company in the industry.</w:t>
       </w:r>
     </w:p>
     <w:sectPr>

</xml_diff>